<commit_message>
Oauth2 demo with Github
</commit_message>
<xml_diff>
--- a/spring_oauth2_notes/OAuth2_DetailNotes.docx
+++ b/spring_oauth2_notes/OAuth2_DetailNotes.docx
@@ -1,6 +1,6 @@
 
 <file path=word/document.xml><?xml version="1.0" encoding="utf-8"?>
-<w:document xmlns:wpc="http://schemas.microsoft.com/office/word/2010/wordprocessingCanvas" xmlns:mc="http://schemas.openxmlformats.org/markup-compatibility/2006" xmlns:o="urn:schemas-microsoft-com:office:office" xmlns:r="http://schemas.openxmlformats.org/officeDocument/2006/relationships" xmlns:m="http://schemas.openxmlformats.org/officeDocument/2006/math" xmlns:v="urn:schemas-microsoft-com:vml" xmlns:wp14="http://schemas.microsoft.com/office/word/2010/wordprocessingDrawing" xmlns:wp="http://schemas.openxmlformats.org/drawingml/2006/wordprocessingDrawing" xmlns:w10="urn:schemas-microsoft-com:office:word" xmlns:w="http://schemas.openxmlformats.org/wordprocessingml/2006/main" xmlns:w14="http://schemas.microsoft.com/office/word/2010/wordml" xmlns:w15="http://schemas.microsoft.com/office/word/2012/wordml" xmlns:wpg="http://schemas.microsoft.com/office/word/2010/wordprocessingGroup" xmlns:wpi="http://schemas.microsoft.com/office/word/2010/wordprocessingInk" xmlns:wne="http://schemas.microsoft.com/office/word/2006/wordml" xmlns:wps="http://schemas.microsoft.com/office/word/2010/wordprocessingShape" mc:Ignorable="w14 w15 wp14">
+<w:document xmlns:wpc="http://schemas.microsoft.com/office/word/2010/wordprocessingCanvas" xmlns:cx="http://schemas.microsoft.com/office/drawing/2014/chartex" xmlns:cx1="http://schemas.microsoft.com/office/drawing/2015/9/8/chartex" xmlns:cx2="http://schemas.microsoft.com/office/drawing/2015/10/21/chartex" xmlns:cx3="http://schemas.microsoft.com/office/drawing/2016/5/9/chartex" xmlns:cx4="http://schemas.microsoft.com/office/drawing/2016/5/10/chartex" xmlns:cx5="http://schemas.microsoft.com/office/drawing/2016/5/11/chartex" xmlns:cx6="http://schemas.microsoft.com/office/drawing/2016/5/12/chartex" xmlns:cx7="http://schemas.microsoft.com/office/drawing/2016/5/13/chartex" xmlns:cx8="http://schemas.microsoft.com/office/drawing/2016/5/14/chartex" xmlns:mc="http://schemas.openxmlformats.org/markup-compatibility/2006" xmlns:aink="http://schemas.microsoft.com/office/drawing/2016/ink" xmlns:am3d="http://schemas.microsoft.com/office/drawing/2017/model3d" xmlns:o="urn:schemas-microsoft-com:office:office" xmlns:oel="http://schemas.microsoft.com/office/2019/extlst" xmlns:r="http://schemas.openxmlformats.org/officeDocument/2006/relationships" xmlns:m="http://schemas.openxmlformats.org/officeDocument/2006/math" xmlns:v="urn:schemas-microsoft-com:vml" xmlns:wp14="http://schemas.microsoft.com/office/word/2010/wordprocessingDrawing" xmlns:wp="http://schemas.openxmlformats.org/drawingml/2006/wordprocessingDrawing" xmlns:w10="urn:schemas-microsoft-com:office:word" xmlns:w="http://schemas.openxmlformats.org/wordprocessingml/2006/main" xmlns:w14="http://schemas.microsoft.com/office/word/2010/wordml" xmlns:w15="http://schemas.microsoft.com/office/word/2012/wordml" xmlns:w16cex="http://schemas.microsoft.com/office/word/2018/wordml/cex" xmlns:w16cid="http://schemas.microsoft.com/office/word/2016/wordml/cid" xmlns:w16="http://schemas.microsoft.com/office/word/2018/wordml" xmlns:w16du="http://schemas.microsoft.com/office/word/2023/wordml/word16du" xmlns:w16sdtdh="http://schemas.microsoft.com/office/word/2020/wordml/sdtdatahash" xmlns:w16sdtfl="http://schemas.microsoft.com/office/word/2024/wordml/sdtformatlock" xmlns:w16se="http://schemas.microsoft.com/office/word/2015/wordml/symex" xmlns:wpg="http://schemas.microsoft.com/office/word/2010/wordprocessingGroup" xmlns:wpi="http://schemas.microsoft.com/office/word/2010/wordprocessingInk" xmlns:wne="http://schemas.microsoft.com/office/word/2006/wordml" xmlns:wps="http://schemas.microsoft.com/office/word/2010/wordprocessingShape" mc:Ignorable="w14 w15 w16se w16cid w16 w16cex w16sdtdh w16sdtfl w16du wp14">
   <w:body>
     <w:p>
       <w:pPr>
@@ -23,29 +23,7 @@
           <w:sz w:val="27"/>
           <w:szCs w:val="27"/>
         </w:rPr>
-        <w:t xml:space="preserve">OAuth2.0 is an Open industry-standard authorization protocol that allows a third party to gain limited access to another HTTP service, such as Google, Facebook, and </w:t>
-      </w:r>
-      <w:proofErr w:type="spellStart"/>
-      <w:r>
-        <w:rPr>
-          <w:rFonts w:ascii="Arial" w:eastAsia="Times New Roman" w:hAnsi="Arial" w:cs="Arial"/>
-          <w:color w:val="273239"/>
-          <w:spacing w:val="2"/>
-          <w:sz w:val="27"/>
-          <w:szCs w:val="27"/>
-        </w:rPr>
-        <w:t>GitHub</w:t>
-      </w:r>
-      <w:proofErr w:type="spellEnd"/>
-      <w:r>
-        <w:rPr>
-          <w:rFonts w:ascii="Arial" w:eastAsia="Times New Roman" w:hAnsi="Arial" w:cs="Arial"/>
-          <w:color w:val="273239"/>
-          <w:spacing w:val="2"/>
-          <w:sz w:val="27"/>
-          <w:szCs w:val="27"/>
-        </w:rPr>
-        <w:t>, on behalf of a user, once the user grants permission to access their credentials. </w:t>
+        <w:t>OAuth2.0 is an Open industry-standard authorization protocol that allows a third party to gain limited access to another HTTP service, such as Google, Facebook, and GitHub, on behalf of a user, once the user grants permission to access their credentials. </w:t>
       </w:r>
     </w:p>
     <w:p>
@@ -119,7 +97,7 @@
           <w:szCs w:val="27"/>
         </w:rPr>
         <w:drawing>
-          <wp:inline distT="0" distB="0" distL="0" distR="0">
+          <wp:inline distT="0" distB="0" distL="0" distR="0" wp14:anchorId="645F9EF7" wp14:editId="4362618A">
             <wp:extent cx="4612640" cy="5278120"/>
             <wp:effectExtent l="0" t="0" r="0" b="0"/>
             <wp:docPr id="2" name="Picture 2" descr="https://media.geeksforgeeks.org/wp-content/uploads/20210916231848/logingfg.png"/>
@@ -240,7 +218,6 @@
         </w:rPr>
         <w:t>Clicking those buttons will get you access to these third-party services without entering any credentials. I’m sure you’re wondering how this happens. </w:t>
       </w:r>
-      <w:proofErr w:type="spellStart"/>
       <w:r>
         <w:rPr>
           <w:rFonts w:ascii="Arial" w:eastAsia="Times New Roman" w:hAnsi="Arial" w:cs="Arial"/>
@@ -256,7 +233,6 @@
         </w:rPr>
         <w:t>OAuth</w:t>
       </w:r>
-      <w:proofErr w:type="spellEnd"/>
       <w:r>
         <w:rPr>
           <w:rFonts w:ascii="Arial" w:eastAsia="Times New Roman" w:hAnsi="Arial" w:cs="Arial"/>
@@ -338,29 +314,7 @@
           <w:sz w:val="27"/>
           <w:szCs w:val="27"/>
         </w:rPr>
-        <w:t xml:space="preserve"> before we dive into </w:t>
-      </w:r>
-      <w:proofErr w:type="spellStart"/>
-      <w:r>
-        <w:rPr>
-          <w:rFonts w:ascii="Arial" w:eastAsia="Times New Roman" w:hAnsi="Arial" w:cs="Arial"/>
-          <w:color w:val="273239"/>
-          <w:spacing w:val="2"/>
-          <w:sz w:val="27"/>
-          <w:szCs w:val="27"/>
-        </w:rPr>
-        <w:t>OAuth</w:t>
-      </w:r>
-      <w:proofErr w:type="spellEnd"/>
-      <w:r>
-        <w:rPr>
-          <w:rFonts w:ascii="Arial" w:eastAsia="Times New Roman" w:hAnsi="Arial" w:cs="Arial"/>
-          <w:color w:val="273239"/>
-          <w:spacing w:val="2"/>
-          <w:sz w:val="27"/>
-          <w:szCs w:val="27"/>
-        </w:rPr>
-        <w:t xml:space="preserve">. Authorization refers to the process by which an </w:t>
+        <w:t xml:space="preserve"> before we dive into OAuth. Authorization refers to the process by which an </w:t>
       </w:r>
       <w:r>
         <w:rPr>
@@ -481,35 +435,7 @@
           <w:szCs w:val="27"/>
           <w:bdr w:val="none" w:sz="0" w:space="0" w:color="auto" w:frame="1"/>
         </w:rPr>
-        <w:t xml:space="preserve">Let us now discuss </w:t>
-      </w:r>
-      <w:proofErr w:type="spellStart"/>
-      <w:r>
-        <w:rPr>
-          <w:rFonts w:ascii="Arial" w:eastAsia="Times New Roman" w:hAnsi="Arial" w:cs="Arial"/>
-          <w:i/>
-          <w:iCs/>
-          <w:color w:val="273239"/>
-          <w:spacing w:val="2"/>
-          <w:sz w:val="27"/>
-          <w:szCs w:val="27"/>
-          <w:bdr w:val="none" w:sz="0" w:space="0" w:color="auto" w:frame="1"/>
-        </w:rPr>
-        <w:t>OAuth</w:t>
-      </w:r>
-      <w:proofErr w:type="spellEnd"/>
-      <w:r>
-        <w:rPr>
-          <w:rFonts w:ascii="Arial" w:eastAsia="Times New Roman" w:hAnsi="Arial" w:cs="Arial"/>
-          <w:i/>
-          <w:iCs/>
-          <w:color w:val="273239"/>
-          <w:spacing w:val="2"/>
-          <w:sz w:val="27"/>
-          <w:szCs w:val="27"/>
-          <w:bdr w:val="none" w:sz="0" w:space="0" w:color="auto" w:frame="1"/>
-        </w:rPr>
-        <w:t>.</w:t>
+        <w:t>Let us now discuss OAuth.</w:t>
       </w:r>
     </w:p>
     <w:p>
@@ -525,7 +451,6 @@
           <w:szCs w:val="27"/>
         </w:rPr>
       </w:pPr>
-      <w:proofErr w:type="spellStart"/>
       <w:r>
         <w:rPr>
           <w:rFonts w:ascii="Arial" w:eastAsia="Times New Roman" w:hAnsi="Arial" w:cs="Arial"/>
@@ -537,9 +462,32 @@
           <w:szCs w:val="27"/>
           <w:bdr w:val="none" w:sz="0" w:space="0" w:color="auto" w:frame="1"/>
         </w:rPr>
-        <w:t>OAuth</w:t>
-      </w:r>
-      <w:proofErr w:type="spellEnd"/>
+        <w:t>OAuth is an open-standard authorization framework that enables third-party applications to gain limited access to user’s data</w:t>
+      </w:r>
+      <w:r>
+        <w:rPr>
+          <w:rFonts w:ascii="Arial" w:eastAsia="Times New Roman" w:hAnsi="Arial" w:cs="Arial"/>
+          <w:color w:val="273239"/>
+          <w:spacing w:val="2"/>
+          <w:sz w:val="27"/>
+          <w:szCs w:val="27"/>
+        </w:rPr>
+        <w:t>.</w:t>
+      </w:r>
+    </w:p>
+    <w:p>
+      <w:pPr>
+        <w:shd w:val="clear" w:color="auto" w:fill="FFFFFF"/>
+        <w:spacing w:after="0" w:line="240" w:lineRule="auto"/>
+        <w:textAlignment w:val="baseline"/>
+        <w:rPr>
+          <w:rFonts w:ascii="Arial" w:eastAsia="Times New Roman" w:hAnsi="Arial" w:cs="Arial"/>
+          <w:color w:val="273239"/>
+          <w:spacing w:val="2"/>
+          <w:sz w:val="27"/>
+          <w:szCs w:val="27"/>
+        </w:rPr>
+      </w:pPr>
       <w:r>
         <w:rPr>
           <w:rFonts w:ascii="Arial" w:eastAsia="Times New Roman" w:hAnsi="Arial" w:cs="Arial"/>
@@ -551,32 +499,18 @@
           <w:szCs w:val="27"/>
           <w:bdr w:val="none" w:sz="0" w:space="0" w:color="auto" w:frame="1"/>
         </w:rPr>
-        <w:t xml:space="preserve"> is an open-standard authorization framework that enables third-party applications to gain limited access to user’s data</w:t>
-      </w:r>
-      <w:r>
-        <w:rPr>
-          <w:rFonts w:ascii="Arial" w:eastAsia="Times New Roman" w:hAnsi="Arial" w:cs="Arial"/>
-          <w:color w:val="273239"/>
-          <w:spacing w:val="2"/>
-          <w:sz w:val="27"/>
-          <w:szCs w:val="27"/>
-        </w:rPr>
-        <w:t>.</w:t>
-      </w:r>
-    </w:p>
-    <w:p>
-      <w:pPr>
-        <w:shd w:val="clear" w:color="auto" w:fill="FFFFFF"/>
-        <w:spacing w:after="0" w:line="240" w:lineRule="auto"/>
-        <w:textAlignment w:val="baseline"/>
-        <w:rPr>
-          <w:rFonts w:ascii="Arial" w:eastAsia="Times New Roman" w:hAnsi="Arial" w:cs="Arial"/>
-          <w:color w:val="273239"/>
-          <w:spacing w:val="2"/>
-          <w:sz w:val="27"/>
-          <w:szCs w:val="27"/>
-        </w:rPr>
-      </w:pPr>
+        <w:t>Essentially</w:t>
+      </w:r>
+      <w:r>
+        <w:rPr>
+          <w:rFonts w:ascii="Arial" w:eastAsia="Times New Roman" w:hAnsi="Arial" w:cs="Arial"/>
+          <w:color w:val="273239"/>
+          <w:spacing w:val="2"/>
+          <w:sz w:val="27"/>
+          <w:szCs w:val="27"/>
+        </w:rPr>
+        <w:t>, </w:t>
+      </w:r>
       <w:r>
         <w:rPr>
           <w:rFonts w:ascii="Arial" w:eastAsia="Times New Roman" w:hAnsi="Arial" w:cs="Arial"/>
@@ -588,45 +522,7 @@
           <w:szCs w:val="27"/>
           <w:bdr w:val="none" w:sz="0" w:space="0" w:color="auto" w:frame="1"/>
         </w:rPr>
-        <w:t>Essentially</w:t>
-      </w:r>
-      <w:r>
-        <w:rPr>
-          <w:rFonts w:ascii="Arial" w:eastAsia="Times New Roman" w:hAnsi="Arial" w:cs="Arial"/>
-          <w:color w:val="273239"/>
-          <w:spacing w:val="2"/>
-          <w:sz w:val="27"/>
-          <w:szCs w:val="27"/>
-        </w:rPr>
-        <w:t>, </w:t>
-      </w:r>
-      <w:proofErr w:type="spellStart"/>
-      <w:r>
-        <w:rPr>
-          <w:rFonts w:ascii="Arial" w:eastAsia="Times New Roman" w:hAnsi="Arial" w:cs="Arial"/>
-          <w:b/>
-          <w:bCs/>
-          <w:color w:val="273239"/>
-          <w:spacing w:val="2"/>
-          <w:sz w:val="27"/>
-          <w:szCs w:val="27"/>
-          <w:bdr w:val="none" w:sz="0" w:space="0" w:color="auto" w:frame="1"/>
-        </w:rPr>
-        <w:t>OAuth</w:t>
-      </w:r>
-      <w:proofErr w:type="spellEnd"/>
-      <w:r>
-        <w:rPr>
-          <w:rFonts w:ascii="Arial" w:eastAsia="Times New Roman" w:hAnsi="Arial" w:cs="Arial"/>
-          <w:b/>
-          <w:bCs/>
-          <w:color w:val="273239"/>
-          <w:spacing w:val="2"/>
-          <w:sz w:val="27"/>
-          <w:szCs w:val="27"/>
-          <w:bdr w:val="none" w:sz="0" w:space="0" w:color="auto" w:frame="1"/>
-        </w:rPr>
-        <w:t xml:space="preserve"> is about delegated access.</w:t>
+        <w:t>OAuth is about delegated access.</w:t>
       </w:r>
     </w:p>
     <w:p>
@@ -801,9 +697,22 @@
           <w:szCs w:val="36"/>
           <w:bdr w:val="none" w:sz="0" w:space="0" w:color="auto" w:frame="1"/>
         </w:rPr>
-        <w:t xml:space="preserve">What is the point of </w:t>
-      </w:r>
-      <w:proofErr w:type="spellStart"/>
+        <w:t>What is the point of OAuth?</w:t>
+      </w:r>
+    </w:p>
+    <w:p>
+      <w:pPr>
+        <w:shd w:val="clear" w:color="auto" w:fill="FFFFFF"/>
+        <w:spacing w:after="0" w:line="240" w:lineRule="auto"/>
+        <w:textAlignment w:val="baseline"/>
+        <w:rPr>
+          <w:rFonts w:ascii="Arial" w:eastAsia="Times New Roman" w:hAnsi="Arial" w:cs="Arial"/>
+          <w:color w:val="273239"/>
+          <w:spacing w:val="2"/>
+          <w:sz w:val="27"/>
+          <w:szCs w:val="27"/>
+        </w:rPr>
+      </w:pPr>
       <w:r>
         <w:rPr>
           <w:rFonts w:ascii="Arial" w:eastAsia="Times New Roman" w:hAnsi="Arial" w:cs="Arial"/>
@@ -811,67 +720,11 @@
           <w:bCs/>
           <w:color w:val="273239"/>
           <w:spacing w:val="2"/>
-          <w:sz w:val="36"/>
-          <w:szCs w:val="36"/>
+          <w:sz w:val="27"/>
+          <w:szCs w:val="27"/>
           <w:bdr w:val="none" w:sz="0" w:space="0" w:color="auto" w:frame="1"/>
         </w:rPr>
-        <w:t>OAuth</w:t>
-      </w:r>
-      <w:proofErr w:type="spellEnd"/>
-      <w:r>
-        <w:rPr>
-          <w:rFonts w:ascii="Arial" w:eastAsia="Times New Roman" w:hAnsi="Arial" w:cs="Arial"/>
-          <w:b/>
-          <w:bCs/>
-          <w:color w:val="273239"/>
-          <w:spacing w:val="2"/>
-          <w:sz w:val="36"/>
-          <w:szCs w:val="36"/>
-          <w:bdr w:val="none" w:sz="0" w:space="0" w:color="auto" w:frame="1"/>
-        </w:rPr>
-        <w:t>?</w:t>
-      </w:r>
-    </w:p>
-    <w:p>
-      <w:pPr>
-        <w:shd w:val="clear" w:color="auto" w:fill="FFFFFF"/>
-        <w:spacing w:after="0" w:line="240" w:lineRule="auto"/>
-        <w:textAlignment w:val="baseline"/>
-        <w:rPr>
-          <w:rFonts w:ascii="Arial" w:eastAsia="Times New Roman" w:hAnsi="Arial" w:cs="Arial"/>
-          <w:color w:val="273239"/>
-          <w:spacing w:val="2"/>
-          <w:sz w:val="27"/>
-          <w:szCs w:val="27"/>
-        </w:rPr>
-      </w:pPr>
-      <w:proofErr w:type="spellStart"/>
-      <w:r>
-        <w:rPr>
-          <w:rFonts w:ascii="Arial" w:eastAsia="Times New Roman" w:hAnsi="Arial" w:cs="Arial"/>
-          <w:b/>
-          <w:bCs/>
-          <w:color w:val="273239"/>
-          <w:spacing w:val="2"/>
-          <w:sz w:val="27"/>
-          <w:szCs w:val="27"/>
-          <w:bdr w:val="none" w:sz="0" w:space="0" w:color="auto" w:frame="1"/>
-        </w:rPr>
-        <w:t>OAuth</w:t>
-      </w:r>
-      <w:proofErr w:type="spellEnd"/>
-      <w:r>
-        <w:rPr>
-          <w:rFonts w:ascii="Arial" w:eastAsia="Times New Roman" w:hAnsi="Arial" w:cs="Arial"/>
-          <w:b/>
-          <w:bCs/>
-          <w:color w:val="273239"/>
-          <w:spacing w:val="2"/>
-          <w:sz w:val="27"/>
-          <w:szCs w:val="27"/>
-          <w:bdr w:val="none" w:sz="0" w:space="0" w:color="auto" w:frame="1"/>
-        </w:rPr>
-        <w:t xml:space="preserve"> allows granular access levels</w:t>
+        <w:t>OAuth allows granular access levels</w:t>
       </w:r>
       <w:r>
         <w:rPr>
@@ -1021,29 +874,7 @@
           <w:sz w:val="27"/>
           <w:szCs w:val="27"/>
         </w:rPr>
-        <w:t xml:space="preserve"> -A third party can only read your data, not modify it. In some instances, it can also request content modifications on your account. For example, you can cross-post a picture from your </w:t>
-      </w:r>
-      <w:proofErr w:type="spellStart"/>
-      <w:r>
-        <w:rPr>
-          <w:rFonts w:ascii="Arial" w:eastAsia="Times New Roman" w:hAnsi="Arial" w:cs="Arial"/>
-          <w:color w:val="273239"/>
-          <w:spacing w:val="2"/>
-          <w:sz w:val="27"/>
-          <w:szCs w:val="27"/>
-        </w:rPr>
-        <w:t>Instagram</w:t>
-      </w:r>
-      <w:proofErr w:type="spellEnd"/>
-      <w:r>
-        <w:rPr>
-          <w:rFonts w:ascii="Arial" w:eastAsia="Times New Roman" w:hAnsi="Arial" w:cs="Arial"/>
-          <w:color w:val="273239"/>
-          <w:spacing w:val="2"/>
-          <w:sz w:val="27"/>
-          <w:szCs w:val="27"/>
-        </w:rPr>
-        <w:t xml:space="preserve"> account to your Facebook account.</w:t>
+        <w:t> -A third party can only read your data, not modify it. In some instances, it can also request content modifications on your account. For example, you can cross-post a picture from your Instagram account to your Facebook account.</w:t>
       </w:r>
     </w:p>
     <w:p>
@@ -1085,51 +916,7 @@
           <w:sz w:val="27"/>
           <w:szCs w:val="27"/>
         </w:rPr>
-        <w:t xml:space="preserve">You can </w:t>
-      </w:r>
-      <w:proofErr w:type="spellStart"/>
-      <w:r>
-        <w:rPr>
-          <w:rFonts w:ascii="Arial" w:eastAsia="Times New Roman" w:hAnsi="Arial" w:cs="Arial"/>
-          <w:color w:val="273239"/>
-          <w:spacing w:val="2"/>
-          <w:sz w:val="27"/>
-          <w:szCs w:val="27"/>
-        </w:rPr>
-        <w:t>deauthorize</w:t>
-      </w:r>
-      <w:proofErr w:type="spellEnd"/>
-      <w:r>
-        <w:rPr>
-          <w:rFonts w:ascii="Arial" w:eastAsia="Times New Roman" w:hAnsi="Arial" w:cs="Arial"/>
-          <w:color w:val="273239"/>
-          <w:spacing w:val="2"/>
-          <w:sz w:val="27"/>
-          <w:szCs w:val="27"/>
-        </w:rPr>
-        <w:t xml:space="preserve"> </w:t>
-      </w:r>
-      <w:proofErr w:type="spellStart"/>
-      <w:r>
-        <w:rPr>
-          <w:rFonts w:ascii="Arial" w:eastAsia="Times New Roman" w:hAnsi="Arial" w:cs="Arial"/>
-          <w:color w:val="273239"/>
-          <w:spacing w:val="2"/>
-          <w:sz w:val="27"/>
-          <w:szCs w:val="27"/>
-        </w:rPr>
-        <w:t>Instagram’s</w:t>
-      </w:r>
-      <w:proofErr w:type="spellEnd"/>
-      <w:r>
-        <w:rPr>
-          <w:rFonts w:ascii="Arial" w:eastAsia="Times New Roman" w:hAnsi="Arial" w:cs="Arial"/>
-          <w:color w:val="273239"/>
-          <w:spacing w:val="2"/>
-          <w:sz w:val="27"/>
-          <w:szCs w:val="27"/>
-        </w:rPr>
-        <w:t xml:space="preserve"> access to your Facebook wall so it can no longer post on your wall.</w:t>
+        <w:t>You can deauthorize Instagram’s access to your Facebook wall so it can no longer post on your wall.</w:t>
       </w:r>
     </w:p>
     <w:p>
@@ -1156,35 +943,7 @@
           <w:szCs w:val="27"/>
           <w:bdr w:val="none" w:sz="0" w:space="0" w:color="auto" w:frame="1"/>
         </w:rPr>
-        <w:t xml:space="preserve">Before we get into how </w:t>
-      </w:r>
-      <w:proofErr w:type="spellStart"/>
-      <w:r>
-        <w:rPr>
-          <w:rFonts w:ascii="Arial" w:eastAsia="Times New Roman" w:hAnsi="Arial" w:cs="Arial"/>
-          <w:i/>
-          <w:iCs/>
-          <w:color w:val="273239"/>
-          <w:spacing w:val="2"/>
-          <w:sz w:val="27"/>
-          <w:szCs w:val="27"/>
-          <w:bdr w:val="none" w:sz="0" w:space="0" w:color="auto" w:frame="1"/>
-        </w:rPr>
-        <w:t>OAuth</w:t>
-      </w:r>
-      <w:proofErr w:type="spellEnd"/>
-      <w:r>
-        <w:rPr>
-          <w:rFonts w:ascii="Arial" w:eastAsia="Times New Roman" w:hAnsi="Arial" w:cs="Arial"/>
-          <w:i/>
-          <w:iCs/>
-          <w:color w:val="273239"/>
-          <w:spacing w:val="2"/>
-          <w:sz w:val="27"/>
-          <w:szCs w:val="27"/>
-          <w:bdr w:val="none" w:sz="0" w:space="0" w:color="auto" w:frame="1"/>
-        </w:rPr>
-        <w:t xml:space="preserve"> works, we’ll discuss the </w:t>
+        <w:t>Before we get into how OAuth works, we’ll discuss the </w:t>
       </w:r>
       <w:r>
         <w:rPr>
@@ -1199,14 +958,11 @@
           <w:szCs w:val="27"/>
           <w:bdr w:val="none" w:sz="0" w:space="0" w:color="auto" w:frame="1"/>
         </w:rPr>
-        <w:t xml:space="preserve">central components of </w:t>
-      </w:r>
-      <w:proofErr w:type="spellStart"/>
-      <w:r>
-        <w:rPr>
-          <w:rFonts w:ascii="Arial" w:eastAsia="Times New Roman" w:hAnsi="Arial" w:cs="Arial"/>
-          <w:b/>
-          <w:bCs/>
+        <w:t>central components of OAuth </w:t>
+      </w:r>
+      <w:r>
+        <w:rPr>
+          <w:rFonts w:ascii="Arial" w:eastAsia="Times New Roman" w:hAnsi="Arial" w:cs="Arial"/>
           <w:i/>
           <w:iCs/>
           <w:color w:val="273239"/>
@@ -1215,35 +971,6 @@
           <w:szCs w:val="27"/>
           <w:bdr w:val="none" w:sz="0" w:space="0" w:color="auto" w:frame="1"/>
         </w:rPr>
-        <w:t>OAuth</w:t>
-      </w:r>
-      <w:proofErr w:type="spellEnd"/>
-      <w:r>
-        <w:rPr>
-          <w:rFonts w:ascii="Arial" w:eastAsia="Times New Roman" w:hAnsi="Arial" w:cs="Arial"/>
-          <w:b/>
-          <w:bCs/>
-          <w:i/>
-          <w:iCs/>
-          <w:color w:val="273239"/>
-          <w:spacing w:val="2"/>
-          <w:sz w:val="27"/>
-          <w:szCs w:val="27"/>
-          <w:bdr w:val="none" w:sz="0" w:space="0" w:color="auto" w:frame="1"/>
-        </w:rPr>
-        <w:t> </w:t>
-      </w:r>
-      <w:r>
-        <w:rPr>
-          <w:rFonts w:ascii="Arial" w:eastAsia="Times New Roman" w:hAnsi="Arial" w:cs="Arial"/>
-          <w:i/>
-          <w:iCs/>
-          <w:color w:val="273239"/>
-          <w:spacing w:val="2"/>
-          <w:sz w:val="27"/>
-          <w:szCs w:val="27"/>
-          <w:bdr w:val="none" w:sz="0" w:space="0" w:color="auto" w:frame="1"/>
-        </w:rPr>
         <w:t>for more clarity.</w:t>
       </w:r>
     </w:p>
@@ -1268,29 +995,7 @@
           <w:sz w:val="27"/>
           <w:szCs w:val="27"/>
         </w:rPr>
-        <w:t xml:space="preserve">The elements of </w:t>
-      </w:r>
-      <w:proofErr w:type="spellStart"/>
-      <w:r>
-        <w:rPr>
-          <w:rFonts w:ascii="Arial" w:eastAsia="Times New Roman" w:hAnsi="Arial" w:cs="Arial"/>
-          <w:color w:val="273239"/>
-          <w:spacing w:val="2"/>
-          <w:sz w:val="27"/>
-          <w:szCs w:val="27"/>
-        </w:rPr>
-        <w:t>OAuth</w:t>
-      </w:r>
-      <w:proofErr w:type="spellEnd"/>
-      <w:r>
-        <w:rPr>
-          <w:rFonts w:ascii="Arial" w:eastAsia="Times New Roman" w:hAnsi="Arial" w:cs="Arial"/>
-          <w:color w:val="273239"/>
-          <w:spacing w:val="2"/>
-          <w:sz w:val="27"/>
-          <w:szCs w:val="27"/>
-        </w:rPr>
-        <w:t xml:space="preserve"> are listed below:</w:t>
+        <w:t>The elements of OAuth are listed below:</w:t>
       </w:r>
     </w:p>
     <w:p>
@@ -1471,29 +1176,7 @@
           <w:sz w:val="27"/>
           <w:szCs w:val="27"/>
         </w:rPr>
-        <w:t> </w:t>
-      </w:r>
-      <w:proofErr w:type="spellStart"/>
-      <w:r>
-        <w:rPr>
-          <w:rFonts w:ascii="Arial" w:eastAsia="Times New Roman" w:hAnsi="Arial" w:cs="Arial"/>
-          <w:color w:val="273239"/>
-          <w:spacing w:val="2"/>
-          <w:sz w:val="27"/>
-          <w:szCs w:val="27"/>
-        </w:rPr>
-        <w:t>OAuth</w:t>
-      </w:r>
-      <w:proofErr w:type="spellEnd"/>
-      <w:r>
-        <w:rPr>
-          <w:rFonts w:ascii="Arial" w:eastAsia="Times New Roman" w:hAnsi="Arial" w:cs="Arial"/>
-          <w:color w:val="273239"/>
-          <w:spacing w:val="2"/>
-          <w:sz w:val="27"/>
-          <w:szCs w:val="27"/>
-        </w:rPr>
-        <w:t xml:space="preserve"> Interactions have the following Actors:</w:t>
+        <w:t> OAuth Interactions have the following Actors:</w:t>
       </w:r>
     </w:p>
     <w:p>
@@ -1521,9 +1204,9 @@
         </w:rPr>
         <w:lastRenderedPageBreak/>
         <w:drawing>
-          <wp:inline distT="0" distB="0" distL="0" distR="0">
-            <wp:extent cx="9526270" cy="6736715"/>
-            <wp:effectExtent l="0" t="0" r="0" b="6985"/>
+          <wp:inline distT="0" distB="0" distL="0" distR="0" wp14:anchorId="3044D5FB" wp14:editId="2C601E7F">
+            <wp:extent cx="7028487" cy="4970352"/>
+            <wp:effectExtent l="0" t="0" r="1270" b="1905"/>
             <wp:docPr id="1" name="Picture 1" descr="https://media.geeksforgeeks.org/wp-content/uploads/20210916231103/OAuth20Actors2.png"/>
             <wp:cNvGraphicFramePr>
               <a:graphicFrameLocks xmlns:a="http://schemas.openxmlformats.org/drawingml/2006/main" noChangeAspect="1"/>
@@ -1553,7 +1236,7 @@
                   <pic:spPr bwMode="auto">
                     <a:xfrm>
                       <a:off x="0" y="0"/>
-                      <a:ext cx="9526270" cy="6736715"/>
+                      <a:ext cx="7044296" cy="4981531"/>
                     </a:xfrm>
                     <a:prstGeom prst="rect">
                       <a:avLst/>
@@ -1638,29 +1321,7 @@
           <w:sz w:val="27"/>
           <w:szCs w:val="27"/>
         </w:rPr>
-        <w:t xml:space="preserve"> are protected data that require </w:t>
-      </w:r>
-      <w:proofErr w:type="spellStart"/>
-      <w:r>
-        <w:rPr>
-          <w:rFonts w:ascii="Arial" w:eastAsia="Times New Roman" w:hAnsi="Arial" w:cs="Arial"/>
-          <w:color w:val="273239"/>
-          <w:spacing w:val="2"/>
-          <w:sz w:val="27"/>
-          <w:szCs w:val="27"/>
-        </w:rPr>
-        <w:t>OAuth</w:t>
-      </w:r>
-      <w:proofErr w:type="spellEnd"/>
-      <w:r>
-        <w:rPr>
-          <w:rFonts w:ascii="Arial" w:eastAsia="Times New Roman" w:hAnsi="Arial" w:cs="Arial"/>
-          <w:color w:val="273239"/>
-          <w:spacing w:val="2"/>
-          <w:sz w:val="27"/>
-          <w:szCs w:val="27"/>
-        </w:rPr>
-        <w:t xml:space="preserve"> to access them.</w:t>
+        <w:t> are protected data that require OAuth to access them.</w:t>
       </w:r>
     </w:p>
     <w:p>
@@ -1734,7 +1395,6 @@
           <w:szCs w:val="27"/>
           <w:bdr w:val="none" w:sz="0" w:space="0" w:color="auto" w:frame="1"/>
         </w:rPr>
-        <w:lastRenderedPageBreak/>
         <w:t>Resource Server</w:t>
       </w:r>
       <w:r>
@@ -1827,7 +1487,6 @@
           <w:szCs w:val="27"/>
         </w:rPr>
       </w:pPr>
-      <w:proofErr w:type="spellStart"/>
       <w:r>
         <w:rPr>
           <w:rFonts w:ascii="Arial" w:eastAsia="Times New Roman" w:hAnsi="Arial" w:cs="Arial"/>
@@ -1839,53 +1498,17 @@
           <w:szCs w:val="27"/>
           <w:bdr w:val="none" w:sz="0" w:space="0" w:color="auto" w:frame="1"/>
         </w:rPr>
-        <w:t>OAuth</w:t>
-      </w:r>
-      <w:proofErr w:type="spellEnd"/>
-      <w:r>
-        <w:rPr>
-          <w:rFonts w:ascii="Arial" w:eastAsia="Times New Roman" w:hAnsi="Arial" w:cs="Arial"/>
-          <w:b/>
-          <w:bCs/>
-          <w:color w:val="273239"/>
-          <w:spacing w:val="2"/>
-          <w:sz w:val="27"/>
-          <w:szCs w:val="27"/>
-          <w:bdr w:val="none" w:sz="0" w:space="0" w:color="auto" w:frame="1"/>
-        </w:rPr>
-        <w:t xml:space="preserve"> is coupled with the Resource Server</w:t>
-      </w:r>
-      <w:r>
-        <w:rPr>
-          <w:rFonts w:ascii="Arial" w:eastAsia="Times New Roman" w:hAnsi="Arial" w:cs="Arial"/>
-          <w:color w:val="273239"/>
-          <w:spacing w:val="2"/>
-          <w:sz w:val="27"/>
-          <w:szCs w:val="27"/>
-        </w:rPr>
-        <w:t xml:space="preserve">. Google implements </w:t>
-      </w:r>
-      <w:proofErr w:type="spellStart"/>
-      <w:r>
-        <w:rPr>
-          <w:rFonts w:ascii="Arial" w:eastAsia="Times New Roman" w:hAnsi="Arial" w:cs="Arial"/>
-          <w:color w:val="273239"/>
-          <w:spacing w:val="2"/>
-          <w:sz w:val="27"/>
-          <w:szCs w:val="27"/>
-        </w:rPr>
-        <w:t>OAuth</w:t>
-      </w:r>
-      <w:proofErr w:type="spellEnd"/>
-      <w:r>
-        <w:rPr>
-          <w:rFonts w:ascii="Arial" w:eastAsia="Times New Roman" w:hAnsi="Arial" w:cs="Arial"/>
-          <w:color w:val="273239"/>
-          <w:spacing w:val="2"/>
-          <w:sz w:val="27"/>
-          <w:szCs w:val="27"/>
-        </w:rPr>
-        <w:t xml:space="preserve"> to validate the authorization of whoever accesses the resource.</w:t>
+        <w:t>OAuth is coupled with the Resource Server</w:t>
+      </w:r>
+      <w:r>
+        <w:rPr>
+          <w:rFonts w:ascii="Arial" w:eastAsia="Times New Roman" w:hAnsi="Arial" w:cs="Arial"/>
+          <w:color w:val="273239"/>
+          <w:spacing w:val="2"/>
+          <w:sz w:val="27"/>
+          <w:szCs w:val="27"/>
+        </w:rPr>
+        <w:t>. Google implements OAuth to validate the authorization of whoever accesses the resource.</w:t>
       </w:r>
     </w:p>
     <w:p>
@@ -1917,6 +1540,7 @@
           <w:szCs w:val="27"/>
           <w:bdr w:val="none" w:sz="0" w:space="0" w:color="auto" w:frame="1"/>
         </w:rPr>
+        <w:lastRenderedPageBreak/>
         <w:t>Authorization Server</w:t>
       </w:r>
       <w:r>
@@ -1927,29 +1551,7 @@
           <w:sz w:val="27"/>
           <w:szCs w:val="27"/>
         </w:rPr>
-        <w:t xml:space="preserve">: </w:t>
-      </w:r>
-      <w:proofErr w:type="spellStart"/>
-      <w:r>
-        <w:rPr>
-          <w:rFonts w:ascii="Arial" w:eastAsia="Times New Roman" w:hAnsi="Arial" w:cs="Arial"/>
-          <w:color w:val="273239"/>
-          <w:spacing w:val="2"/>
-          <w:sz w:val="27"/>
-          <w:szCs w:val="27"/>
-        </w:rPr>
-        <w:t>OAuth’s</w:t>
-      </w:r>
-      <w:proofErr w:type="spellEnd"/>
-      <w:r>
-        <w:rPr>
-          <w:rFonts w:ascii="Arial" w:eastAsia="Times New Roman" w:hAnsi="Arial" w:cs="Arial"/>
-          <w:color w:val="273239"/>
-          <w:spacing w:val="2"/>
-          <w:sz w:val="27"/>
-          <w:szCs w:val="27"/>
-        </w:rPr>
-        <w:t xml:space="preserve"> main engine that creates access tokens.</w:t>
+        <w:t>: OAuth’s main engine that creates access tokens.</w:t>
       </w:r>
     </w:p>
     <w:p>
@@ -2072,7 +1674,7 @@
           <w:sz w:val="27"/>
           <w:szCs w:val="27"/>
         </w:rPr>
-        <w:t xml:space="preserve">, when you link your </w:t>
+        <w:t xml:space="preserve">, when you link your GitHub account to it or import an existing repository. The </w:t>
       </w:r>
       <w:proofErr w:type="spellStart"/>
       <w:r>
@@ -2083,7 +1685,7 @@
           <w:sz w:val="27"/>
           <w:szCs w:val="27"/>
         </w:rPr>
-        <w:t>GitHub</w:t>
+        <w:t>Github</w:t>
       </w:r>
       <w:proofErr w:type="spellEnd"/>
       <w:r>
@@ -2094,35 +1696,10 @@
           <w:sz w:val="27"/>
           <w:szCs w:val="27"/>
         </w:rPr>
-        <w:t xml:space="preserve"> account to it or import an existing repository. The </w:t>
-      </w:r>
-      <w:proofErr w:type="spellStart"/>
-      <w:r>
-        <w:rPr>
-          <w:rFonts w:ascii="Arial" w:eastAsia="Times New Roman" w:hAnsi="Arial" w:cs="Arial"/>
-          <w:color w:val="273239"/>
-          <w:spacing w:val="2"/>
-          <w:sz w:val="27"/>
-          <w:szCs w:val="27"/>
-        </w:rPr>
-        <w:t>Github</w:t>
-      </w:r>
-      <w:proofErr w:type="spellEnd"/>
-      <w:r>
-        <w:rPr>
-          <w:rFonts w:ascii="Arial" w:eastAsia="Times New Roman" w:hAnsi="Arial" w:cs="Arial"/>
-          <w:color w:val="273239"/>
-          <w:spacing w:val="2"/>
-          <w:sz w:val="27"/>
-          <w:szCs w:val="27"/>
-        </w:rPr>
         <w:t xml:space="preserve"> account you are using will send you an email confirming this.</w:t>
       </w:r>
     </w:p>
-    <w:p>
-      <w:bookmarkStart w:id="0" w:name="_GoBack"/>
-      <w:bookmarkEnd w:id="0"/>
-    </w:p>
+    <w:p/>
     <w:sectPr>
       <w:pgSz w:w="12240" w:h="15840"/>
       <w:pgMar w:top="1440" w:right="1440" w:bottom="1440" w:left="1440" w:header="720" w:footer="720" w:gutter="0"/>
@@ -2134,8 +1711,8 @@
 </file>
 
 <file path=word/numbering.xml><?xml version="1.0" encoding="utf-8"?>
-<w:numbering xmlns:wpc="http://schemas.microsoft.com/office/word/2010/wordprocessingCanvas" xmlns:mc="http://schemas.openxmlformats.org/markup-compatibility/2006" xmlns:o="urn:schemas-microsoft-com:office:office" xmlns:r="http://schemas.openxmlformats.org/officeDocument/2006/relationships" xmlns:m="http://schemas.openxmlformats.org/officeDocument/2006/math" xmlns:v="urn:schemas-microsoft-com:vml" xmlns:wp14="http://schemas.microsoft.com/office/word/2010/wordprocessingDrawing" xmlns:wp="http://schemas.openxmlformats.org/drawingml/2006/wordprocessingDrawing" xmlns:w10="urn:schemas-microsoft-com:office:word" xmlns:w="http://schemas.openxmlformats.org/wordprocessingml/2006/main" xmlns:w14="http://schemas.microsoft.com/office/word/2010/wordml" xmlns:w15="http://schemas.microsoft.com/office/word/2012/wordml" xmlns:wpg="http://schemas.microsoft.com/office/word/2010/wordprocessingGroup" xmlns:wpi="http://schemas.microsoft.com/office/word/2010/wordprocessingInk" xmlns:wne="http://schemas.microsoft.com/office/word/2006/wordml" xmlns:wps="http://schemas.microsoft.com/office/word/2010/wordprocessingShape" mc:Ignorable="w14 w15 wp14">
-  <w:abstractNum w:abstractNumId="0">
+<w:numbering xmlns:wpc="http://schemas.microsoft.com/office/word/2010/wordprocessingCanvas" xmlns:cx="http://schemas.microsoft.com/office/drawing/2014/chartex" xmlns:cx1="http://schemas.microsoft.com/office/drawing/2015/9/8/chartex" xmlns:cx2="http://schemas.microsoft.com/office/drawing/2015/10/21/chartex" xmlns:cx3="http://schemas.microsoft.com/office/drawing/2016/5/9/chartex" xmlns:cx4="http://schemas.microsoft.com/office/drawing/2016/5/10/chartex" xmlns:cx5="http://schemas.microsoft.com/office/drawing/2016/5/11/chartex" xmlns:cx6="http://schemas.microsoft.com/office/drawing/2016/5/12/chartex" xmlns:cx7="http://schemas.microsoft.com/office/drawing/2016/5/13/chartex" xmlns:cx8="http://schemas.microsoft.com/office/drawing/2016/5/14/chartex" xmlns:mc="http://schemas.openxmlformats.org/markup-compatibility/2006" xmlns:aink="http://schemas.microsoft.com/office/drawing/2016/ink" xmlns:am3d="http://schemas.microsoft.com/office/drawing/2017/model3d" xmlns:o="urn:schemas-microsoft-com:office:office" xmlns:oel="http://schemas.microsoft.com/office/2019/extlst" xmlns:r="http://schemas.openxmlformats.org/officeDocument/2006/relationships" xmlns:m="http://schemas.openxmlformats.org/officeDocument/2006/math" xmlns:v="urn:schemas-microsoft-com:vml" xmlns:wp14="http://schemas.microsoft.com/office/word/2010/wordprocessingDrawing" xmlns:wp="http://schemas.openxmlformats.org/drawingml/2006/wordprocessingDrawing" xmlns:w10="urn:schemas-microsoft-com:office:word" xmlns:w="http://schemas.openxmlformats.org/wordprocessingml/2006/main" xmlns:w14="http://schemas.microsoft.com/office/word/2010/wordml" xmlns:w15="http://schemas.microsoft.com/office/word/2012/wordml" xmlns:w16cex="http://schemas.microsoft.com/office/word/2018/wordml/cex" xmlns:w16cid="http://schemas.microsoft.com/office/word/2016/wordml/cid" xmlns:w16="http://schemas.microsoft.com/office/word/2018/wordml" xmlns:w16du="http://schemas.microsoft.com/office/word/2023/wordml/word16du" xmlns:w16sdtdh="http://schemas.microsoft.com/office/word/2020/wordml/sdtdatahash" xmlns:w16sdtfl="http://schemas.microsoft.com/office/word/2024/wordml/sdtformatlock" xmlns:w16se="http://schemas.microsoft.com/office/word/2015/wordml/symex" xmlns:wpg="http://schemas.microsoft.com/office/word/2010/wordprocessingGroup" xmlns:wpi="http://schemas.microsoft.com/office/word/2010/wordprocessingInk" xmlns:wne="http://schemas.microsoft.com/office/word/2006/wordml" xmlns:wps="http://schemas.microsoft.com/office/word/2010/wordprocessingShape" mc:Ignorable="w14 w15 w16se w16cid w16 w16cex w16sdtdh w16sdtfl w16du wp14">
+  <w:abstractNum w:abstractNumId="0" w15:restartNumberingAfterBreak="0">
     <w:nsid w:val="02B04B17"/>
     <w:multiLevelType w:val="multilevel"/>
     <w:tmpl w:val="0D966DC6"/>
@@ -2284,7 +1861,7 @@
       </w:rPr>
     </w:lvl>
   </w:abstractNum>
-  <w:abstractNum w:abstractNumId="1">
+  <w:abstractNum w:abstractNumId="1" w15:restartNumberingAfterBreak="0">
     <w:nsid w:val="22F9618A"/>
     <w:multiLevelType w:val="multilevel"/>
     <w:tmpl w:val="725A5298"/>
@@ -2397,7 +1974,7 @@
       </w:pPr>
     </w:lvl>
   </w:abstractNum>
-  <w:abstractNum w:abstractNumId="2">
+  <w:abstractNum w:abstractNumId="2" w15:restartNumberingAfterBreak="0">
     <w:nsid w:val="67272197"/>
     <w:multiLevelType w:val="multilevel"/>
     <w:tmpl w:val="BC9E944A"/>
@@ -2546,7 +2123,7 @@
       </w:rPr>
     </w:lvl>
   </w:abstractNum>
-  <w:abstractNum w:abstractNumId="3">
+  <w:abstractNum w:abstractNumId="3" w15:restartNumberingAfterBreak="0">
     <w:nsid w:val="7736238A"/>
     <w:multiLevelType w:val="multilevel"/>
     <w:tmpl w:val="2D0EF754"/>
@@ -2695,23 +2272,23 @@
       </w:rPr>
     </w:lvl>
   </w:abstractNum>
-  <w:num w:numId="1">
+  <w:num w:numId="1" w16cid:durableId="300506148">
     <w:abstractNumId w:val="2"/>
   </w:num>
-  <w:num w:numId="2">
+  <w:num w:numId="2" w16cid:durableId="1581911987">
     <w:abstractNumId w:val="1"/>
   </w:num>
-  <w:num w:numId="3">
+  <w:num w:numId="3" w16cid:durableId="1255625929">
     <w:abstractNumId w:val="3"/>
   </w:num>
-  <w:num w:numId="4">
+  <w:num w:numId="4" w16cid:durableId="390227572">
     <w:abstractNumId w:val="0"/>
   </w:num>
 </w:numbering>
 </file>
 
 <file path=word/styles.xml><?xml version="1.0" encoding="utf-8"?>
-<w:styles xmlns:mc="http://schemas.openxmlformats.org/markup-compatibility/2006" xmlns:r="http://schemas.openxmlformats.org/officeDocument/2006/relationships" xmlns:w="http://schemas.openxmlformats.org/wordprocessingml/2006/main" xmlns:w14="http://schemas.microsoft.com/office/word/2010/wordml" xmlns:w15="http://schemas.microsoft.com/office/word/2012/wordml" mc:Ignorable="w14 w15">
+<w:styles xmlns:mc="http://schemas.openxmlformats.org/markup-compatibility/2006" xmlns:r="http://schemas.openxmlformats.org/officeDocument/2006/relationships" xmlns:w="http://schemas.openxmlformats.org/wordprocessingml/2006/main" xmlns:w14="http://schemas.microsoft.com/office/word/2010/wordml" xmlns:w15="http://schemas.microsoft.com/office/word/2012/wordml" xmlns:w16cex="http://schemas.microsoft.com/office/word/2018/wordml/cex" xmlns:w16cid="http://schemas.microsoft.com/office/word/2016/wordml/cid" xmlns:w16="http://schemas.microsoft.com/office/word/2018/wordml" xmlns:w16du="http://schemas.microsoft.com/office/word/2023/wordml/word16du" xmlns:w16sdtdh="http://schemas.microsoft.com/office/word/2020/wordml/sdtdatahash" xmlns:w16sdtfl="http://schemas.microsoft.com/office/word/2024/wordml/sdtformatlock" xmlns:w16se="http://schemas.microsoft.com/office/word/2015/wordml/symex" mc:Ignorable="w14 w15 w16se w16cid w16 w16cex w16sdtdh w16sdtfl w16du">
   <w:docDefaults>
     <w:rPrDefault>
       <w:rPr>
@@ -2727,7 +2304,7 @@
       </w:pPr>
     </w:pPrDefault>
   </w:docDefaults>
-  <w:latentStyles w:defLockedState="0" w:defUIPriority="99" w:defSemiHidden="0" w:defUnhideWhenUsed="0" w:defQFormat="0" w:count="371">
+  <w:latentStyles w:defLockedState="0" w:defUIPriority="99" w:defSemiHidden="0" w:defUnhideWhenUsed="0" w:defQFormat="0" w:count="376">
     <w:lsdException w:name="Normal" w:uiPriority="0" w:qFormat="1"/>
     <w:lsdException w:name="heading 1" w:uiPriority="9" w:qFormat="1"/>
     <w:lsdException w:name="heading 2" w:semiHidden="1" w:uiPriority="9" w:unhideWhenUsed="1" w:qFormat="1"/>
@@ -3099,6 +2676,11 @@
     <w:lsdException w:name="List Table 5 Dark Accent 6" w:uiPriority="50"/>
     <w:lsdException w:name="List Table 6 Colorful Accent 6" w:uiPriority="51"/>
     <w:lsdException w:name="List Table 7 Colorful Accent 6" w:uiPriority="52"/>
+    <w:lsdException w:name="Mention" w:semiHidden="1" w:unhideWhenUsed="1"/>
+    <w:lsdException w:name="Smart Hyperlink" w:semiHidden="1" w:unhideWhenUsed="1"/>
+    <w:lsdException w:name="Hashtag" w:semiHidden="1" w:unhideWhenUsed="1"/>
+    <w:lsdException w:name="Unresolved Mention" w:semiHidden="1" w:unhideWhenUsed="1"/>
+    <w:lsdException w:name="Smart Link" w:semiHidden="1" w:unhideWhenUsed="1"/>
   </w:latentStyles>
   <w:style w:type="paragraph" w:default="1" w:styleId="Normal">
     <w:name w:val="Normal"/>

</xml_diff>